<commit_message>
Complete Week 6 Activities
</commit_message>
<xml_diff>
--- a/week6/Stage_3_Lab_Student_Handout.docx
+++ b/week6/Stage_3_Lab_Student_Handout.docx
@@ -1,6 +1,6 @@
 
 <file path=word/document.xml><?xml version="1.0" encoding="utf-8"?>
-<w:document xmlns:wpc="http://schemas.microsoft.com/office/word/2010/wordprocessingCanvas" xmlns:cx="http://schemas.microsoft.com/office/drawing/2014/chartex" xmlns:cx1="http://schemas.microsoft.com/office/drawing/2015/9/8/chartex" xmlns:cx2="http://schemas.microsoft.com/office/drawing/2015/10/21/chartex" xmlns:cx3="http://schemas.microsoft.com/office/drawing/2016/5/9/chartex" xmlns:cx4="http://schemas.microsoft.com/office/drawing/2016/5/10/chartex" xmlns:cx5="http://schemas.microsoft.com/office/drawing/2016/5/11/chartex" xmlns:cx6="http://schemas.microsoft.com/office/drawing/2016/5/12/chartex" xmlns:cx7="http://schemas.microsoft.com/office/drawing/2016/5/13/chartex" xmlns:cx8="http://schemas.microsoft.com/office/drawing/2016/5/14/chartex" xmlns:mc="http://schemas.openxmlformats.org/markup-compatibility/2006" xmlns:aink="http://schemas.microsoft.com/office/drawing/2016/ink" xmlns:am3d="http://schemas.microsoft.com/office/drawing/2017/model3d" xmlns:o="urn:schemas-microsoft-com:office:office" xmlns:oel="http://schemas.microsoft.com/office/2019/extlst" xmlns:r="http://schemas.openxmlformats.org/officeDocument/2006/relationships" xmlns:m="http://schemas.openxmlformats.org/officeDocument/2006/math" xmlns:v="urn:schemas-microsoft-com:vml" xmlns:wp14="http://schemas.microsoft.com/office/word/2010/wordprocessingDrawing" xmlns:wp="http://schemas.openxmlformats.org/drawingml/2006/wordprocessingDrawing" xmlns:w10="urn:schemas-microsoft-com:office:word" xmlns:w="http://schemas.openxmlformats.org/wordprocessingml/2006/main" xmlns:w14="http://schemas.microsoft.com/office/word/2010/wordml" xmlns:w15="http://schemas.microsoft.com/office/word/2012/wordml" xmlns:w16cei="http://schemas.microsoft.com/office/word/2026/wordml/cei" xmlns:w16cex="http://schemas.microsoft.com/office/word/2018/wordml/cex" xmlns:w16cid="http://schemas.microsoft.com/office/word/2016/wordml/cid" xmlns:w16="http://schemas.microsoft.com/office/word/2018/wordml" xmlns:w16du="http://schemas.microsoft.com/office/word/2023/wordml/word16du" xmlns:w16sdtdh="http://schemas.microsoft.com/office/word/2020/wordml/sdtdatahash" xmlns:w16sdtfl="http://schemas.microsoft.com/office/word/2024/wordml/sdtformatlock" xmlns:w16se="http://schemas.microsoft.com/office/word/2015/wordml/symex" xmlns:wpg="http://schemas.microsoft.com/office/word/2010/wordprocessingGroup" xmlns:wpi="http://schemas.microsoft.com/office/word/2010/wordprocessingInk" xmlns:wne="http://schemas.microsoft.com/office/word/2006/wordml" xmlns:wps="http://schemas.microsoft.com/office/word/2010/wordprocessingShape" mc:Ignorable="w14 w15 w16se w16cid w16 w16cex w16sdtdh w16sdtfl w16du wp14">
+<w:document xmlns:wpc="http://schemas.microsoft.com/office/word/2010/wordprocessingCanvas" xmlns:cx="http://schemas.microsoft.com/office/drawing/2014/chartex" xmlns:cx1="http://schemas.microsoft.com/office/drawing/2015/9/8/chartex" xmlns:cx2="http://schemas.microsoft.com/office/drawing/2015/10/21/chartex" xmlns:cx3="http://schemas.microsoft.com/office/drawing/2016/5/9/chartex" xmlns:cx4="http://schemas.microsoft.com/office/drawing/2016/5/10/chartex" xmlns:cx5="http://schemas.microsoft.com/office/drawing/2016/5/11/chartex" xmlns:cx6="http://schemas.microsoft.com/office/drawing/2016/5/12/chartex" xmlns:cx7="http://schemas.microsoft.com/office/drawing/2016/5/13/chartex" xmlns:cx8="http://schemas.microsoft.com/office/drawing/2016/5/14/chartex" xmlns:mc="http://schemas.openxmlformats.org/markup-compatibility/2006" xmlns:aink="http://schemas.microsoft.com/office/drawing/2016/ink" xmlns:am3d="http://schemas.microsoft.com/office/drawing/2017/model3d" xmlns:o="urn:schemas-microsoft-com:office:office" xmlns:oel="http://schemas.microsoft.com/office/2019/extlst" xmlns:r="http://schemas.openxmlformats.org/officeDocument/2006/relationships" xmlns:m="http://schemas.openxmlformats.org/officeDocument/2006/math" xmlns:v="urn:schemas-microsoft-com:vml" xmlns:wp14="http://schemas.microsoft.com/office/word/2010/wordprocessingDrawing" xmlns:wp="http://schemas.openxmlformats.org/drawingml/2006/wordprocessingDrawing" xmlns:w10="urn:schemas-microsoft-com:office:word" xmlns:w="http://schemas.openxmlformats.org/wordprocessingml/2006/main" xmlns:w14="http://schemas.microsoft.com/office/word/2010/wordml" xmlns:w15="http://schemas.microsoft.com/office/word/2012/wordml" xmlns:w16cex="http://schemas.microsoft.com/office/word/2018/wordml/cex" xmlns:w16cid="http://schemas.microsoft.com/office/word/2016/wordml/cid" xmlns:w16="http://schemas.microsoft.com/office/word/2018/wordml" xmlns:w16du="http://schemas.microsoft.com/office/word/2023/wordml/word16du" xmlns:w16sdtdh="http://schemas.microsoft.com/office/word/2020/wordml/sdtdatahash" xmlns:w16sdtfl="http://schemas.microsoft.com/office/word/2024/wordml/sdtformatlock" xmlns:w16se="http://schemas.microsoft.com/office/word/2015/wordml/symex" xmlns:wpg="http://schemas.microsoft.com/office/word/2010/wordprocessingGroup" xmlns:wpi="http://schemas.microsoft.com/office/word/2010/wordprocessingInk" xmlns:wne="http://schemas.microsoft.com/office/word/2006/wordml" xmlns:wps="http://schemas.microsoft.com/office/word/2010/wordprocessingShape" mc:Ignorable="w14 w15 w16se w16cid w16 w16cex w16sdtdh w16sdtfl w16du wp14">
   <w:body>
     <w:p>
       <w:pPr>
@@ -8,7 +8,14 @@
         <w:jc w:val="center"/>
       </w:pPr>
       <w:r>
-        <w:t>Assignment 2- Case Study</w:t>
+        <w:rPr>
+          <w:b/>
+          <w:bCs/>
+        </w:rPr>
+        <w:t>Assignment</w:t>
+      </w:r>
+      <w:r>
+        <w:t xml:space="preserve"> 2- Case Study</w:t>
       </w:r>
     </w:p>
     <w:p>
@@ -63,6 +70,84 @@
       </w:r>
     </w:p>
     <w:p>
+      <w:r>
+        <w:rPr>
+          <w:b/>
+          <w:bCs/>
+        </w:rPr>
+        <w:t>Nouns</w:t>
+      </w:r>
+      <w:r>
+        <w:rPr>
+          <w:b/>
+          <w:bCs/>
+        </w:rPr>
+        <w:t xml:space="preserve"> (Candidate concepts)</w:t>
+      </w:r>
+      <w:r>
+        <w:br/>
+      </w:r>
+      <w:r>
+        <w:t>Patient, Practitioner, Appointment, appointment status</w:t>
+      </w:r>
+      <w:r>
+        <w:t>, appointment history, schedule, reminders, Clinic Owner, and Reception.</w:t>
+      </w:r>
+    </w:p>
+    <w:p>
+      <w:r>
+        <w:rPr>
+          <w:b/>
+          <w:bCs/>
+        </w:rPr>
+        <w:t>Verbs</w:t>
+      </w:r>
+      <w:r>
+        <w:rPr>
+          <w:b/>
+          <w:bCs/>
+        </w:rPr>
+        <w:t xml:space="preserve"> (Candidate behaviours)</w:t>
+      </w:r>
+      <w:r>
+        <w:br/>
+      </w:r>
+      <w:r>
+        <w:t>Book, prevent a clash, display</w:t>
+      </w:r>
+      <w:r>
+        <w:t>, cancel, reschedule, search, record, retrieve, restrict, reject, opt in, receive, and validate.</w:t>
+      </w:r>
+    </w:p>
+    <w:p>
+      <w:r>
+        <w:rPr>
+          <w:b/>
+          <w:bCs/>
+        </w:rPr>
+        <w:t>Business rules (constraints)</w:t>
+      </w:r>
+      <w:r>
+        <w:br/>
+        <w:t xml:space="preserve">A practitioner </w:t>
+      </w:r>
+      <w:r>
+        <w:t xml:space="preserve">cannot </w:t>
+      </w:r>
+      <w:r>
+        <w:t>be booked for 2 appointments at the same time and date (FR-02). A</w:t>
+      </w:r>
+      <w:r>
+        <w:t>ccess to a practitioner’s schedule is limited to that practitioner</w:t>
+      </w:r>
+      <w:r>
+        <w:t>, “higher ups” and reception (FR-03)</w:t>
+      </w:r>
+      <w:r>
+        <w:t>.</w:t>
+      </w:r>
+    </w:p>
+    <w:p>
       <w:pPr>
         <w:pStyle w:val="Heading1"/>
       </w:pPr>
@@ -73,6 +158,11 @@
     <w:p>
       <w:r>
         <w:t>Record candidate concepts, supporting requirements, state and behaviour.</w:t>
+      </w:r>
+    </w:p>
+    <w:p>
+      <w:r>
+        <w:t>Completed in the SmartCare v0.3 Workbook</w:t>
       </w:r>
     </w:p>
     <w:p>
@@ -89,6 +179,11 @@
       </w:r>
     </w:p>
     <w:p>
+      <w:r>
+        <w:t>Completed in the SmartCare v0.3 Workbook</w:t>
+      </w:r>
+    </w:p>
+    <w:p>
       <w:pPr>
         <w:pStyle w:val="Heading1"/>
       </w:pPr>
@@ -99,6 +194,11 @@
     <w:p>
       <w:r>
         <w:t>Draw classes, attributes, operations, associations and multiplicities.</w:t>
+      </w:r>
+    </w:p>
+    <w:p>
+      <w:r>
+        <w:t>Completed in the SmartCare v0.3 Workbook</w:t>
       </w:r>
     </w:p>
     <w:p>
@@ -115,16 +215,27 @@
       </w:r>
     </w:p>
     <w:p>
+      <w:r>
+        <w:t>Completed in the SmartCare v0.3 Workbook</w:t>
+      </w:r>
+    </w:p>
+    <w:p>
       <w:pPr>
         <w:pStyle w:val="Heading1"/>
       </w:pPr>
       <w:r>
+        <w:lastRenderedPageBreak/>
         <w:t>F - Compare and Decide</w:t>
       </w:r>
     </w:p>
     <w:p>
       <w:r>
         <w:t>Record at least one accepted, modified and rejected AI suggestion.</w:t>
+      </w:r>
+    </w:p>
+    <w:p>
+      <w:r>
+        <w:t>Completed in the SmartCare v0.3 Workbook</w:t>
       </w:r>
     </w:p>
     <w:p>
@@ -141,6 +252,20 @@
       </w:r>
     </w:p>
     <w:p>
+      <w:r>
+        <w:t>Check the included PythonSkeleton.py</w:t>
+      </w:r>
+      <w:r>
+        <w:t xml:space="preserve">: </w:t>
+      </w:r>
+      <w:r>
+        <w:t>Patient, Practitioner and Appointment classes with the attributes and method signatures shown in the UML diagram. Methods are stubs (pass/NotImplementedError) - no business logic is implemented yet, per the instruction not to build full behaviour at this stage. The one exception is Appointment.validate(), which is called from __init__ to check an appointment has a patient, practitioner and time</w:t>
+      </w:r>
+      <w:r>
+        <w:t>.</w:t>
+      </w:r>
+    </w:p>
+    <w:p>
       <w:pPr>
         <w:pStyle w:val="Heading1"/>
       </w:pPr>
@@ -151,6 +276,19 @@
     <w:p>
       <w:r>
         <w:t>Check model-code consistency; do not implement full behaviour yet.</w:t>
+      </w:r>
+    </w:p>
+    <w:p>
+      <w:r>
+        <w:t xml:space="preserve">Checked the code skeleton against the UML diagram attribute-by-attribute and method-by-method: Patient (patient_id, name, phone, reminders_opt_in / book_appointment, view_upcoming_appointments, opt_in_reminders), Practitioner (practitioner_id, name / get_schedule, has_conflict, update_status), and Appointment (appointment_id, when, status / validate, cancel, reschedule, record_outcome) all match exactly - no class, attribute or method exists in one artefact but not the other. The only behaviour implemented is </w:t>
+      </w:r>
+      <w:proofErr w:type="gramStart"/>
+      <w:r>
+        <w:t>validate(</w:t>
+      </w:r>
+      <w:proofErr w:type="gramEnd"/>
+      <w:r>
+        <w:t>), as noted in Part G; every other method is a stub, so the model and code are consistent without pretending the system does more than it currently does.</w:t>
       </w:r>
     </w:p>
     <w:p>
@@ -166,6 +304,149 @@
         <w:t>What modelling decision was hardest? Where did AI over-design? What evidence supported your final choices?</w:t>
       </w:r>
     </w:p>
+    <w:p>
+      <w:r>
+        <w:t xml:space="preserve">The hardest decision to make was what I shouldn’t be modeling yet. It is easy to justify adding things like a </w:t>
+      </w:r>
+      <w:proofErr w:type="gramStart"/>
+      <w:r>
+        <w:t>schedule</w:t>
+      </w:r>
+      <w:proofErr w:type="gramEnd"/>
+      <w:r>
+        <w:t xml:space="preserve"> class</w:t>
+      </w:r>
+      <w:r>
+        <w:t xml:space="preserve"> or a </w:t>
+      </w:r>
+      <w:proofErr w:type="gramStart"/>
+      <w:r>
+        <w:t>notificationManager</w:t>
+      </w:r>
+      <w:proofErr w:type="gramEnd"/>
+      <w:r>
+        <w:t xml:space="preserve"> because they sound reasonable to add. The hardest discipline was asking whether any confirmed requirement needed them to </w:t>
+      </w:r>
+      <w:r>
+        <w:t>exist and</w:t>
+      </w:r>
+      <w:r>
+        <w:t xml:space="preserve"> </w:t>
+      </w:r>
+      <w:r>
+        <w:t xml:space="preserve">then </w:t>
+      </w:r>
+      <w:r>
+        <w:t>deciding they didn’t.</w:t>
+      </w:r>
+    </w:p>
+    <w:p>
+      <w:r>
+        <w:t>The Ai over-designed by proposing manager</w:t>
+      </w:r>
+      <w:r>
+        <w:t>/control classes (e.g. PatientManager, ClinicController, ScheduleEngine)</w:t>
+      </w:r>
+      <w:r>
+        <w:t xml:space="preserve"> that don’t trace to any of the requirement IDs.</w:t>
+      </w:r>
+      <w:r>
+        <w:t xml:space="preserve"> These are patterns Ai has seen in many other </w:t>
+      </w:r>
+      <w:proofErr w:type="gramStart"/>
+      <w:r>
+        <w:t>systems, but</w:t>
+      </w:r>
+      <w:proofErr w:type="gramEnd"/>
+      <w:r>
+        <w:t xml:space="preserve"> are not things SmartCare’s</w:t>
+      </w:r>
+      <w:r>
+        <w:t xml:space="preserve"> brief </w:t>
+      </w:r>
+      <w:proofErr w:type="gramStart"/>
+      <w:r>
+        <w:t>actually asked</w:t>
+      </w:r>
+      <w:proofErr w:type="gramEnd"/>
+      <w:r>
+        <w:t xml:space="preserve"> for – a ClinicController </w:t>
+      </w:r>
+      <w:proofErr w:type="gramStart"/>
+      <w:r>
+        <w:t>in particular assumes</w:t>
+      </w:r>
+      <w:proofErr w:type="gramEnd"/>
+      <w:r>
+        <w:t xml:space="preserve"> a multi-clinic</w:t>
+      </w:r>
+      <w:r>
+        <w:t xml:space="preserve"> or top-level coordination need that was never originally mentioned.</w:t>
+      </w:r>
+    </w:p>
+    <w:p>
+      <w:r>
+        <w:t>The requirement that changed my model the most was FR-05 (reminders). I initially reached</w:t>
+      </w:r>
+      <w:r>
+        <w:t xml:space="preserve"> for a separate reminder or </w:t>
+      </w:r>
+      <w:proofErr w:type="gramStart"/>
+      <w:r>
+        <w:t>notificationManager</w:t>
+      </w:r>
+      <w:proofErr w:type="gramEnd"/>
+      <w:r>
+        <w:t xml:space="preserve"> class</w:t>
+      </w:r>
+      <w:r>
+        <w:t xml:space="preserve">, but there </w:t>
+      </w:r>
+      <w:r>
+        <w:t>weren’t</w:t>
+      </w:r>
+      <w:r>
+        <w:t xml:space="preserve"> enough distinct state or </w:t>
+      </w:r>
+      <w:r>
+        <w:t xml:space="preserve">behaviors to justify adding one. A single flag and a single method on </w:t>
+      </w:r>
+      <w:r>
+        <w:t>patients</w:t>
+      </w:r>
+      <w:r>
+        <w:t xml:space="preserve"> </w:t>
+      </w:r>
+      <w:r>
+        <w:t>do</w:t>
+      </w:r>
+      <w:r>
+        <w:t xml:space="preserve"> the same job with one less moving part to maintain.</w:t>
+      </w:r>
+    </w:p>
+    <w:p>
+      <w:r>
+        <w:t>Evidence supported the final choices</w:t>
+      </w:r>
+      <w:r>
+        <w:t xml:space="preserve"> because every class</w:t>
+      </w:r>
+      <w:r>
+        <w:t>, attribute, and method in the model can be traced back to a specific FR.</w:t>
+      </w:r>
+      <w:r>
+        <w:t xml:space="preserve"> Where I couldn’t point to a requirement, like the clinic or manager class, I left it out rather than </w:t>
+      </w:r>
+      <w:r>
+        <w:t>including</w:t>
+      </w:r>
+      <w:r>
+        <w:t xml:space="preserve"> it because it seemed like</w:t>
+      </w:r>
+      <w:r>
+        <w:t xml:space="preserve"> good design.</w:t>
+      </w:r>
+    </w:p>
     <w:sectPr>
       <w:pgSz w:w="12240" w:h="15840"/>
       <w:pgMar w:top="936" w:right="1080" w:bottom="936" w:left="1080" w:header="720" w:footer="720" w:gutter="0"/>
@@ -177,7 +458,7 @@
 </file>
 
 <file path=word/numbering.xml><?xml version="1.0" encoding="utf-8"?>
-<w:numbering xmlns:wpc="http://schemas.microsoft.com/office/word/2010/wordprocessingCanvas" xmlns:cx="http://schemas.microsoft.com/office/drawing/2014/chartex" xmlns:cx1="http://schemas.microsoft.com/office/drawing/2015/9/8/chartex" xmlns:cx2="http://schemas.microsoft.com/office/drawing/2015/10/21/chartex" xmlns:cx3="http://schemas.microsoft.com/office/drawing/2016/5/9/chartex" xmlns:cx4="http://schemas.microsoft.com/office/drawing/2016/5/10/chartex" xmlns:cx5="http://schemas.microsoft.com/office/drawing/2016/5/11/chartex" xmlns:cx6="http://schemas.microsoft.com/office/drawing/2016/5/12/chartex" xmlns:cx7="http://schemas.microsoft.com/office/drawing/2016/5/13/chartex" xmlns:cx8="http://schemas.microsoft.com/office/drawing/2016/5/14/chartex" xmlns:mc="http://schemas.openxmlformats.org/markup-compatibility/2006" xmlns:aink="http://schemas.microsoft.com/office/drawing/2016/ink" xmlns:am3d="http://schemas.microsoft.com/office/drawing/2017/model3d" xmlns:o="urn:schemas-microsoft-com:office:office" xmlns:oel="http://schemas.microsoft.com/office/2019/extlst" xmlns:r="http://schemas.openxmlformats.org/officeDocument/2006/relationships" xmlns:m="http://schemas.openxmlformats.org/officeDocument/2006/math" xmlns:v="urn:schemas-microsoft-com:vml" xmlns:wp14="http://schemas.microsoft.com/office/word/2010/wordprocessingDrawing" xmlns:wp="http://schemas.openxmlformats.org/drawingml/2006/wordprocessingDrawing" xmlns:w10="urn:schemas-microsoft-com:office:word" xmlns:w="http://schemas.openxmlformats.org/wordprocessingml/2006/main" xmlns:w14="http://schemas.microsoft.com/office/word/2010/wordml" xmlns:w15="http://schemas.microsoft.com/office/word/2012/wordml" xmlns:w16cei="http://schemas.microsoft.com/office/word/2026/wordml/cei" xmlns:w16cex="http://schemas.microsoft.com/office/word/2018/wordml/cex" xmlns:w16cid="http://schemas.microsoft.com/office/word/2016/wordml/cid" xmlns:w16="http://schemas.microsoft.com/office/word/2018/wordml" xmlns:w16du="http://schemas.microsoft.com/office/word/2023/wordml/word16du" xmlns:w16sdtdh="http://schemas.microsoft.com/office/word/2020/wordml/sdtdatahash" xmlns:w16sdtfl="http://schemas.microsoft.com/office/word/2024/wordml/sdtformatlock" xmlns:w16se="http://schemas.microsoft.com/office/word/2015/wordml/symex" xmlns:wpg="http://schemas.microsoft.com/office/word/2010/wordprocessingGroup" xmlns:wpi="http://schemas.microsoft.com/office/word/2010/wordprocessingInk" xmlns:wne="http://schemas.microsoft.com/office/word/2006/wordml" xmlns:wps="http://schemas.microsoft.com/office/word/2010/wordprocessingShape" mc:Ignorable="w14 w15 w16se w16cid w16 w16cex w16sdtdh w16sdtfl w16du wp14">
+<w:numbering xmlns:wpc="http://schemas.microsoft.com/office/word/2010/wordprocessingCanvas" xmlns:cx="http://schemas.microsoft.com/office/drawing/2014/chartex" xmlns:cx1="http://schemas.microsoft.com/office/drawing/2015/9/8/chartex" xmlns:cx2="http://schemas.microsoft.com/office/drawing/2015/10/21/chartex" xmlns:cx3="http://schemas.microsoft.com/office/drawing/2016/5/9/chartex" xmlns:cx4="http://schemas.microsoft.com/office/drawing/2016/5/10/chartex" xmlns:cx5="http://schemas.microsoft.com/office/drawing/2016/5/11/chartex" xmlns:cx6="http://schemas.microsoft.com/office/drawing/2016/5/12/chartex" xmlns:cx7="http://schemas.microsoft.com/office/drawing/2016/5/13/chartex" xmlns:cx8="http://schemas.microsoft.com/office/drawing/2016/5/14/chartex" xmlns:mc="http://schemas.openxmlformats.org/markup-compatibility/2006" xmlns:aink="http://schemas.microsoft.com/office/drawing/2016/ink" xmlns:am3d="http://schemas.microsoft.com/office/drawing/2017/model3d" xmlns:o="urn:schemas-microsoft-com:office:office" xmlns:oel="http://schemas.microsoft.com/office/2019/extlst" xmlns:r="http://schemas.openxmlformats.org/officeDocument/2006/relationships" xmlns:m="http://schemas.openxmlformats.org/officeDocument/2006/math" xmlns:v="urn:schemas-microsoft-com:vml" xmlns:wp14="http://schemas.microsoft.com/office/word/2010/wordprocessingDrawing" xmlns:wp="http://schemas.openxmlformats.org/drawingml/2006/wordprocessingDrawing" xmlns:w10="urn:schemas-microsoft-com:office:word" xmlns:w="http://schemas.openxmlformats.org/wordprocessingml/2006/main" xmlns:w14="http://schemas.microsoft.com/office/word/2010/wordml" xmlns:w15="http://schemas.microsoft.com/office/word/2012/wordml" xmlns:w16cex="http://schemas.microsoft.com/office/word/2018/wordml/cex" xmlns:w16cid="http://schemas.microsoft.com/office/word/2016/wordml/cid" xmlns:w16="http://schemas.microsoft.com/office/word/2018/wordml" xmlns:w16du="http://schemas.microsoft.com/office/word/2023/wordml/word16du" xmlns:w16sdtdh="http://schemas.microsoft.com/office/word/2020/wordml/sdtdatahash" xmlns:w16sdtfl="http://schemas.microsoft.com/office/word/2024/wordml/sdtformatlock" xmlns:w16se="http://schemas.microsoft.com/office/word/2015/wordml/symex" xmlns:wpg="http://schemas.microsoft.com/office/word/2010/wordprocessingGroup" xmlns:wpi="http://schemas.microsoft.com/office/word/2010/wordprocessingInk" xmlns:wne="http://schemas.microsoft.com/office/word/2006/wordml" xmlns:wps="http://schemas.microsoft.com/office/word/2010/wordprocessingShape" mc:Ignorable="w14 w15 w16se w16cid w16 w16cex w16sdtdh w16sdtfl w16du wp14">
   <w:abstractNum w:abstractNumId="0" w15:restartNumberingAfterBreak="0">
     <w:nsid w:val="FFFFFF7C"/>
     <w:multiLevelType w:val="singleLevel"/>

</xml_diff>